<commit_message>
A design prototype has been added and the user flow file has been updated
</commit_message>
<xml_diff>
--- a/docs/Аналитика проекта/Функционал, сценарии.docx
+++ b/docs/Аналитика проекта/Функционал, сценарии.docx
@@ -61,10 +61,7 @@
         <w:t>,</w:t>
       </w:r>
       <w:r>
-        <w:t xml:space="preserve"> указать описание для операции</w:t>
-      </w:r>
-      <w:r>
-        <w:t xml:space="preserve"> (</w:t>
+        <w:t xml:space="preserve"> указать описание для операции (</w:t>
       </w:r>
       <w:proofErr w:type="spellStart"/>
       <w:r>
@@ -185,13 +182,25 @@
         <w:t>, можно и другое что-нибудь</w:t>
       </w:r>
       <w:r>
-        <w:t>) Ввести название категории, ограничение по категории (сколько из установленной цены можно потратить), выбрать картинку для категории (</w:t>
+        <w:t>) Ввести название категории,</w:t>
+      </w:r>
+      <w:r>
+        <w:t xml:space="preserve"> тип операции для категории,</w:t>
+      </w:r>
+      <w:r>
+        <w:t xml:space="preserve"> ограничение по категории (сколько из установленной цены можно потратить), выбрать картинку для категории (</w:t>
       </w:r>
       <w:r>
         <w:t>эти картинки будут отображаться рядом с названием, чтобы видно всё было и сразу понятно</w:t>
       </w:r>
       <w:r>
-        <w:t xml:space="preserve">). </w:t>
+        <w:t>)</w:t>
+      </w:r>
+      <w:r>
+        <w:t>, задний фон для иконки</w:t>
+      </w:r>
+      <w:r>
+        <w:t xml:space="preserve">. </w:t>
       </w:r>
     </w:p>
     <w:p/>

</xml_diff>